<commit_message>
Update walkthrough Word document with deployment guides
</commit_message>
<xml_diff>
--- a/NSERS_Walkthrough_and_Process_Flow.docx
+++ b/NSERS_Walkthrough_and_Process_Flow.docx
@@ -1462,6 +1462,319 @@
       </w:r>
       <w:r>
         <w:t xml:space="preserve"> form and click submit to watch the AI scanner console verify your incident in real-time.</w:t>
+      </w:r>
+    </w:p>
+    <w:p>
+      <w:pPr>
+        <w:jc w:val="center"/>
+      </w:pPr>
+      <w:r>
+        <w:t>____________________________________________________</w:t>
+      </w:r>
+    </w:p>
+    <w:p>
+      <w:pPr>
+        <w:pStyle w:val="Heading2"/>
+      </w:pPr>
+      <w:r>
+        <w:rPr>
+          <w:color w:val="EA4335"/>
+        </w:rPr>
+        <w:t>🚀 GitHub Repository &amp; Vercel Deployment</w:t>
+      </w:r>
+    </w:p>
+    <w:p>
+      <w:r>
+        <w:t>The project has been initialized and pushed to your official repository:</w:t>
+      </w:r>
+    </w:p>
+    <w:p>
+      <w:pPr>
+        <w:pStyle w:val="ListBullet"/>
+      </w:pPr>
+      <w:r/>
+      <w:r>
+        <w:rPr>
+          <w:b/>
+        </w:rPr>
+        <w:t>Repository URL</w:t>
+      </w:r>
+      <w:r>
+        <w:t xml:space="preserve">: </w:t>
+      </w:r>
+      <w:r>
+        <w:rPr>
+          <w:color w:val="1A73E8"/>
+          <w:u w:val="single"/>
+        </w:rPr>
+        <w:t>uk0976/NSERS---National-Smart-Emergency-Response-System</w:t>
+      </w:r>
+      <w:r/>
+    </w:p>
+    <w:p>
+      <w:pPr>
+        <w:pStyle w:val="Heading3"/>
+      </w:pPr>
+      <w:r>
+        <w:rPr>
+          <w:color w:val="5F6368"/>
+        </w:rPr>
+        <w:t>⚡ Steps to Deploy on Vercel:</w:t>
+      </w:r>
+    </w:p>
+    <w:p>
+      <w:r>
+        <w:t xml:space="preserve">1. </w:t>
+      </w:r>
+      <w:r>
+        <w:rPr>
+          <w:b/>
+        </w:rPr>
+        <w:t>Sign Up / Log In to Vercel</w:t>
+      </w:r>
+      <w:r>
+        <w:t>:</w:t>
+      </w:r>
+    </w:p>
+    <w:p>
+      <w:pPr>
+        <w:pStyle w:val="ListBullet"/>
+      </w:pPr>
+      <w:r>
+        <w:t xml:space="preserve">Go to </w:t>
+      </w:r>
+      <w:r>
+        <w:rPr>
+          <w:color w:val="1A73E8"/>
+          <w:u w:val="single"/>
+        </w:rPr>
+        <w:t>Vercel</w:t>
+      </w:r>
+      <w:r>
+        <w:t xml:space="preserve"> and click </w:t>
+      </w:r>
+      <w:r>
+        <w:rPr>
+          <w:b/>
+        </w:rPr>
+        <w:t>Sign Up</w:t>
+      </w:r>
+      <w:r>
+        <w:t xml:space="preserve"> or </w:t>
+      </w:r>
+      <w:r>
+        <w:rPr>
+          <w:b/>
+        </w:rPr>
+        <w:t>Log In</w:t>
+      </w:r>
+      <w:r>
+        <w:t>.</w:t>
+      </w:r>
+    </w:p>
+    <w:p>
+      <w:pPr>
+        <w:pStyle w:val="ListBullet"/>
+      </w:pPr>
+      <w:r>
+        <w:t xml:space="preserve">Choose </w:t>
+      </w:r>
+      <w:r>
+        <w:rPr>
+          <w:b/>
+        </w:rPr>
+        <w:t>Continue with GitHub</w:t>
+      </w:r>
+      <w:r>
+        <w:t xml:space="preserve"> to link your repositories.</w:t>
+      </w:r>
+    </w:p>
+    <w:p>
+      <w:r>
+        <w:t xml:space="preserve">2. </w:t>
+      </w:r>
+      <w:r>
+        <w:rPr>
+          <w:b/>
+        </w:rPr>
+        <w:t>Import Project</w:t>
+      </w:r>
+      <w:r>
+        <w:t>:</w:t>
+      </w:r>
+    </w:p>
+    <w:p>
+      <w:pPr>
+        <w:pStyle w:val="ListBullet"/>
+      </w:pPr>
+      <w:r>
+        <w:t xml:space="preserve">Once logged in, click </w:t>
+      </w:r>
+      <w:r>
+        <w:rPr>
+          <w:b/>
+        </w:rPr>
+        <w:t>Add New...</w:t>
+      </w:r>
+      <w:r>
+        <w:t xml:space="preserve"> -&gt; </w:t>
+      </w:r>
+      <w:r>
+        <w:rPr>
+          <w:b/>
+        </w:rPr>
+        <w:t>Project</w:t>
+      </w:r>
+      <w:r>
+        <w:t>.</w:t>
+      </w:r>
+    </w:p>
+    <w:p>
+      <w:pPr>
+        <w:pStyle w:val="ListBullet"/>
+      </w:pPr>
+      <w:r>
+        <w:t xml:space="preserve">Under the imported Git list, select </w:t>
+      </w:r>
+      <w:r>
+        <w:rPr>
+          <w:b/>
+        </w:rPr>
+        <w:t>uk0976/NSERS---National-Smart-Emergency-Response-System</w:t>
+      </w:r>
+      <w:r>
+        <w:t xml:space="preserve"> and click </w:t>
+      </w:r>
+      <w:r>
+        <w:rPr>
+          <w:b/>
+        </w:rPr>
+        <w:t>Import</w:t>
+      </w:r>
+      <w:r>
+        <w:t>.</w:t>
+      </w:r>
+    </w:p>
+    <w:p>
+      <w:r>
+        <w:t xml:space="preserve">3. </w:t>
+      </w:r>
+      <w:r>
+        <w:rPr>
+          <w:b/>
+        </w:rPr>
+        <w:t>Configure Project Settings</w:t>
+      </w:r>
+      <w:r>
+        <w:t>:</w:t>
+      </w:r>
+    </w:p>
+    <w:p>
+      <w:pPr>
+        <w:pStyle w:val="ListBullet"/>
+      </w:pPr>
+      <w:r>
+        <w:t>Since this is a pure static frontend project (HTML, CSS, JS), Vercel will automatically configure the presets.</w:t>
+      </w:r>
+    </w:p>
+    <w:p>
+      <w:pPr>
+        <w:pStyle w:val="ListBullet"/>
+      </w:pPr>
+      <w:r>
+        <w:t>Keep the default settings:</w:t>
+      </w:r>
+    </w:p>
+    <w:p>
+      <w:pPr>
+        <w:pStyle w:val="ListBullet"/>
+      </w:pPr>
+      <w:r/>
+      <w:r>
+        <w:rPr>
+          <w:b/>
+        </w:rPr>
+        <w:t>Framework Preset</w:t>
+      </w:r>
+      <w:r>
+        <w:t>: *Other* (or Leave blank)</w:t>
+      </w:r>
+    </w:p>
+    <w:p>
+      <w:pPr>
+        <w:pStyle w:val="ListBullet"/>
+      </w:pPr>
+      <w:r/>
+      <w:r>
+        <w:rPr>
+          <w:b/>
+        </w:rPr>
+        <w:t>Root Directory</w:t>
+      </w:r>
+      <w:r>
+        <w:t>: `./` (Root)</w:t>
+      </w:r>
+    </w:p>
+    <w:p>
+      <w:pPr>
+        <w:pStyle w:val="ListBullet"/>
+      </w:pPr>
+      <w:r/>
+      <w:r>
+        <w:rPr>
+          <w:b/>
+        </w:rPr>
+        <w:t>Build and Development Settings</w:t>
+      </w:r>
+      <w:r>
+        <w:t>: *Default* (No build command or framework build scripts are required)</w:t>
+      </w:r>
+    </w:p>
+    <w:p>
+      <w:r>
+        <w:t xml:space="preserve">4. </w:t>
+      </w:r>
+      <w:r>
+        <w:rPr>
+          <w:b/>
+        </w:rPr>
+        <w:t>Deploy</w:t>
+      </w:r>
+      <w:r>
+        <w:t>:</w:t>
+      </w:r>
+    </w:p>
+    <w:p>
+      <w:pPr>
+        <w:pStyle w:val="ListBullet"/>
+      </w:pPr>
+      <w:r>
+        <w:t xml:space="preserve">Click the </w:t>
+      </w:r>
+      <w:r>
+        <w:rPr>
+          <w:b/>
+        </w:rPr>
+        <w:t>Deploy</w:t>
+      </w:r>
+      <w:r>
+        <w:t xml:space="preserve"> button.</w:t>
+      </w:r>
+    </w:p>
+    <w:p>
+      <w:pPr>
+        <w:pStyle w:val="ListBullet"/>
+      </w:pPr>
+      <w:r>
+        <w:t>Vercel will clone the repo, parse the HTML/CSS/JS, and deploy the application in under 30 seconds.</w:t>
+      </w:r>
+    </w:p>
+    <w:p>
+      <w:pPr>
+        <w:pStyle w:val="ListBullet"/>
+      </w:pPr>
+      <w:r>
+        <w:t>You will be provided a live production link (e.g., `nsers-national-smart-emergency-response-system.vercel.app`).</w:t>
       </w:r>
     </w:p>
     <w:sectPr>

</xml_diff>

<commit_message>
Update walkthrough Word document with mobile compatibility details
</commit_message>
<xml_diff>
--- a/NSERS_Walkthrough_and_Process_Flow.docx
+++ b/NSERS_Walkthrough_and_Process_Flow.docx
@@ -1372,6 +1372,161 @@
       </w:pPr>
       <w:r>
         <w:t>Fraud check database queue to blacklist spam IP/Aadhaar accounts.</w:t>
+      </w:r>
+    </w:p>
+    <w:p>
+      <w:pPr>
+        <w:pStyle w:val="Heading2"/>
+      </w:pPr>
+      <w:r>
+        <w:rPr>
+          <w:color w:val="EA4335"/>
+        </w:rPr>
+        <w:t>📱 Mobile Responsiveness &amp; Compatibility</w:t>
+      </w:r>
+    </w:p>
+    <w:p>
+      <w:r>
+        <w:t>The platform has been optimized for full responsiveness across all major mobile viewports (smartphones and tablets):</w:t>
+      </w:r>
+    </w:p>
+    <w:p>
+      <w:pPr>
+        <w:pStyle w:val="Heading3"/>
+      </w:pPr>
+      <w:r>
+        <w:rPr>
+          <w:color w:val="5F6368"/>
+        </w:rPr>
+        <w:t>1. Slide-Out Drawer Navigation:</w:t>
+      </w:r>
+    </w:p>
+    <w:p>
+      <w:pPr>
+        <w:pStyle w:val="ListBullet"/>
+      </w:pPr>
+      <w:r>
+        <w:t xml:space="preserve">Added a </w:t>
+      </w:r>
+      <w:r>
+        <w:rPr>
+          <w:b/>
+        </w:rPr>
+        <w:t>Hamburger Menu Trigger Button</w:t>
+      </w:r>
+      <w:r>
+        <w:t xml:space="preserve"> in the top navigation header bar (visible only on mobile viewports).</w:t>
+      </w:r>
+    </w:p>
+    <w:p>
+      <w:pPr>
+        <w:pStyle w:val="ListBullet"/>
+      </w:pPr>
+      <w:r>
+        <w:t xml:space="preserve">Tapping the hamburger icon slides in a premium </w:t>
+      </w:r>
+      <w:r>
+        <w:rPr>
+          <w:b/>
+        </w:rPr>
+        <w:t>Material Navigation Drawer</w:t>
+      </w:r>
+      <w:r>
+        <w:t xml:space="preserve"> from the left side.</w:t>
+      </w:r>
+    </w:p>
+    <w:p>
+      <w:pPr>
+        <w:pStyle w:val="ListBullet"/>
+      </w:pPr>
+      <w:r>
+        <w:t>Added a blur-backdrop overlay: tapping anywhere outside the drawer automatically collapses it.</w:t>
+      </w:r>
+    </w:p>
+    <w:p>
+      <w:pPr>
+        <w:pStyle w:val="ListBullet"/>
+      </w:pPr>
+      <w:r/>
+      <w:r>
+        <w:rPr>
+          <w:b/>
+        </w:rPr>
+        <w:t>Auto-Collapse Routing</w:t>
+      </w:r>
+      <w:r>
+        <w:t>: Selecting any menu item automatically slides the navigation drawer closed so the user has immediate, full-screen visibility of the selected page.</w:t>
+      </w:r>
+    </w:p>
+    <w:p>
+      <w:pPr>
+        <w:pStyle w:val="Heading3"/>
+      </w:pPr>
+      <w:r>
+        <w:rPr>
+          <w:color w:val="5F6368"/>
+        </w:rPr>
+        <w:t>2. Layout &amp; Grid Adjustments:</w:t>
+      </w:r>
+    </w:p>
+    <w:p>
+      <w:pPr>
+        <w:pStyle w:val="ListBullet"/>
+      </w:pPr>
+      <w:r/>
+      <w:r>
+        <w:rPr>
+          <w:b/>
+        </w:rPr>
+        <w:t>India Map Radar</w:t>
+      </w:r>
+      <w:r>
+        <w:t>: Scaled height down from 400px to 260px on mobile screens to ensure the hero content doesn't require excessive scrolling.</w:t>
+      </w:r>
+    </w:p>
+    <w:p>
+      <w:pPr>
+        <w:pStyle w:val="ListBullet"/>
+      </w:pPr>
+      <w:r/>
+      <w:r>
+        <w:rPr>
+          <w:b/>
+        </w:rPr>
+        <w:t>One-Click Hotline Directory</w:t>
+      </w:r>
+      <w:r>
+        <w:t>: Refactored grid sizing on small viewports (width &lt;= 480px) to show helpline badges in a clean 2-column layout rather than stacking them vertically.</w:t>
+      </w:r>
+    </w:p>
+    <w:p>
+      <w:pPr>
+        <w:pStyle w:val="ListBullet"/>
+      </w:pPr>
+      <w:r/>
+      <w:r>
+        <w:rPr>
+          <w:b/>
+        </w:rPr>
+        <w:t>Top Nav Adaptability</w:t>
+      </w:r>
+      <w:r>
+        <w:t>: The user profile avatar and role picker scale dynamically; on very small screens, the role badge picker hides the text label and displays only the Material icon to avoid text overlap.</w:t>
+      </w:r>
+    </w:p>
+    <w:p>
+      <w:pPr>
+        <w:pStyle w:val="ListBullet"/>
+      </w:pPr>
+      <w:r/>
+      <w:r>
+        <w:rPr>
+          <w:b/>
+        </w:rPr>
+        <w:t>Panel Paddings</w:t>
+      </w:r>
+      <w:r>
+        <w:t>: Reduced internal padding from 24px to 16px to maximize physical screen space on mobile viewports.</w:t>
       </w:r>
     </w:p>
     <w:p>

</xml_diff>

<commit_message>
Update walkthrough Word document with package.json deliverables list
</commit_message>
<xml_diff>
--- a/NSERS_Walkthrough_and_Process_Flow.docx
+++ b/NSERS_Walkthrough_and_Process_Flow.docx
@@ -81,7 +81,7 @@
     </w:p>
     <w:p>
       <w:r>
-        <w:t>The prototype is built as a highly responsive Single Page Application (SPA) structured across three primary files and a comprehensive walkthrough Word document:</w:t>
+        <w:t>The prototype is built as a highly responsive Single Page Application (SPA) structured across three primary files, project files, and a comprehensive walkthrough Word document:</w:t>
       </w:r>
     </w:p>
     <w:p>
@@ -129,6 +129,20 @@
     <w:p>
       <w:r>
         <w:t xml:space="preserve">4. </w:t>
+      </w:r>
+      <w:r>
+        <w:rPr>
+          <w:b/>
+        </w:rPr>
+        <w:t>[package.json](file:///c:/Users/Umer%20Khan/OneDrive/Desktop/NSERS/package.json)</w:t>
+      </w:r>
+      <w:r>
+        <w:t>: Project config and fast static build script for Vercel pipeline override.</w:t>
+      </w:r>
+    </w:p>
+    <w:p>
+      <w:r>
+        <w:t xml:space="preserve">5. </w:t>
       </w:r>
       <w:r>
         <w:rPr>

</xml_diff>